<commit_message>
Audit batch, items 1-15: the series consent is filled from its master with no placeholders and the members as series managers where the agreement says so; the couple's TOD words live in Exhibit A's row; a beneficiary may be any person or entity and an entity owner makes none; the multi-member S forms gain the eligible-shareholder limits; two leftovers fixed; the borrowing-limit card and texts follow the form; Learn More and the Instructions corrected; the filing sheet names an individual representative and carries a PLLC's purpose; certificate order emails titled for what was bought; the payment page fits a conversion; public copy matches the product
Co-Authored-By: Claude Fable 5.1 <noreply@anthropic.com>
</commit_message>
<xml_diff>
--- a/docs/word/FPSLLC Operating Agreement - Manager-Managed (S Corporation) - DRAFT.docx
+++ b/docs/word/FPSLLC Operating Agreement - Manager-Managed (S Corporation) - DRAFT.docx
@@ -1725,7 +1725,7 @@
           <w:sz w:val="24"/>
           <w:szCs w:val="24"/>
         </w:rPr>
-        <w:t xml:space="preserve"> Each Member's Membership Interest is "registered" with the Company within the meaning of s. 711.501(7), Florida Statutes. Exhibit A serves as the initial "registration in beneficiary form" under ss. 711.50–711.512, Florida Statutes, and reflects each Member's designation, if any, of the person or persons who will become the owner of that Member's Membership Interest upon that Member's death. A Member who is an individual may designate any person or entity as a beneficiary. A designation may name a backup beneficiary to take if the first beneficiary does not survive the Member. Members who hold a Membership Interest jointly as tenants in common may not designate a TOD beneficiary. A Member may change, delete, or add a TOD designation by a signed writing, witnessed by two witnesses, delivered to the Manager; the change is effective upon receipt unless the Manager objects in writing within seven (7) days, and the Manager shall thereafter update Exhibit A (though updating is not required for effectiveness). Upon the designating Member's death, the designated beneficiary automatically succeeds to the deceased Member's transferable interest — including the economic rights of the deceased Member's Percentage Interest — taking subject to this Agreement, and holds the rights of a transferee described in Section 10.3 until admitted as a Member. A beneficiary is admitted as a Member upon delivery to the Company of a written agreement to be bound by this Agreement and the written consent of a Majority in Interest of the Members other than the deceased Member.</w:t>
+        <w:t xml:space="preserve"> Each Member's Membership Interest is "registered" with the Company within the meaning of s. 711.501(7), Florida Statutes. Exhibit A serves as the initial "registration in beneficiary form" under ss. 711.50–711.512, Florida Statutes, and reflects each Member's designation, if any, of the person or persons who will become the owner of that Member's Membership Interest upon that Member's death. Subject to Section 9.3(b), a Member who is an individual may designate any person or entity as a beneficiary. A designation may name a backup beneficiary to take if the first beneficiary does not survive the Member. Members who hold a Membership Interest jointly as tenants in common may not designate a TOD beneficiary. A Member may change, delete, or add a TOD designation by a signed writing, witnessed by two witnesses, delivered to the Manager; the change is effective upon receipt unless the Manager objects in writing within seven (7) days, and the Manager shall thereafter update Exhibit A (though updating is not required for effectiveness). Upon the designating Member's death, the designated beneficiary automatically succeeds to the deceased Member's transferable interest — including the economic rights of the deceased Member's Percentage Interest — taking subject to this Agreement, and holds the rights of a transferee described in Section 10.3 until admitted as a Member. A beneficiary is admitted as a Member upon delivery to the Company of a written agreement to be bound by this Agreement and the written consent of a Majority in Interest of the Members other than the deceased Member.</w:t>
       </w:r>
     </w:p>
     <w:p>
@@ -3630,7 +3630,7 @@
           <w:sz w:val="24"/>
           <w:szCs w:val="24"/>
         </w:rPr>
-        <w:t xml:space="preserve"> Members and upon the person's delivery of a signed agreement to be bound by this Agreement, except that (a) a TOD beneficiary is admitted as provided in Section 4.11, and (b) a permitted family transferee under Section 10.2 may be admitted with the written consent of a Majority in Interest of the Members other than the transferor.</w:t>
+        <w:t xml:space="preserve"> Members and upon the person's delivery of a signed agreement to be bound by this Agreement, and only if that person is an eligible S corporation shareholder under section 1361 of the Code and the admission would not cause the number of shareholders to exceed the limit of that section, except that (a) a TOD beneficiary is admitted as provided in Section 4.11, and (b) a permitted family transferee under Section 10.2 may be admitted with the written consent of a Majority in Interest of the Members other than the transferor. Any purported admission in violation of this Section is null and void ab initio and shall be given no force or effect for any purpose.</w:t>
       </w:r>
     </w:p>
     <w:p>
@@ -5457,7 +5457,22 @@
           <w:sz w:val="24"/>
           <w:szCs w:val="24"/>
         </w:rPr>
-        <w:t xml:space="preserve">| [MEMBER NAME] | [MEMBER TOD] | [MEMBER TOD BACKUP] |</w:t>
+        <w:t xml:space="preserve">| [MEMBER NAME] | [MEMBER TOD] (effective at the death of the last surviving spouse) | [MEMBER TOD BACKUP] |</w:t>
+      </w:r>
+    </w:p>
+    <w:p>
+      <w:pPr>
+        <w:widowControl/>
+        <w:spacing w:after="160"/>
+        <w:jc w:val="both"/>
+      </w:pPr>
+      <w:r>
+        <w:rPr>
+          <w:rFonts w:ascii="Times New Roman" w:hAnsi="Times New Roman"/>
+          <w:sz w:val="24"/>
+          <w:szCs w:val="24"/>
+        </w:rPr>
+        <w:t xml:space="preserve">A designation is effective only in favor of a beneficiary that is an eligible S corporation shareholder (Section 9.3(b)).</w:t>
       </w:r>
     </w:p>
     <w:p>

</xml_diff>

<commit_message>
Recover approved batches 11 12 and 16
</commit_message>
<xml_diff>
--- a/docs/word/FPSLLC Operating Agreement - Manager-Managed (S Corporation) - DRAFT.docx
+++ b/docs/word/FPSLLC Operating Agreement - Manager-Managed (S Corporation) - DRAFT.docx
@@ -275,7 +275,7 @@
           <w:sz w:val="24"/>
           <w:szCs w:val="24"/>
         </w:rPr>
-        <w:t xml:space="preserve"> The Company is a limited liability company organized under the Florida Revised Uniform Limited Liability Company Act, Chapter 605, Florida Statutes (the "Act"). Upon the filing of its first Protected Series Designation with the Department, the Company is, and shall be identified in its records and dealings as, a </w:t>
+        <w:t xml:space="preserve"> The Company is a limited liability company organized under the Florida Revised Limited Liability Company Act, Chapter 605, Florida Statutes (the "Act"). Upon the filing of its first Protected Series Designation with the Department, the Company is, and shall be identified in its records and dealings as, a </w:t>
       </w:r>
       <w:r>
         <w:rPr>
@@ -357,7 +357,24 @@
           <w:sz w:val="24"/>
           <w:szCs w:val="24"/>
         </w:rPr>
-        <w:t xml:space="preserve"> The purpose of the Company, and of each Protected Series, is to engage in any lawful business, purpose, or activity for which limited liability companies may be organized under the Act, together with any additional purpose set forth in the Articles of Organization and, as to a Protected Series, any additional purpose set forth in its Series Exhibit. An additional purpose so stated is cumulative and does not limit the general purpose stated in this Section. The Company, and each Protected Series in its own name, shall have all powers conferred by the Act, including with respect to each Protected Series the power to enter into and enforce contracts; to acquire, own, hold, improve, lease, encumber, and convey real, personal, and intangible property; to grant liens and security interests in its Associated Assets; to open and maintain deposit and investment accounts; to sue and be sued; and to conduct its activities and affairs in its own name, all as contemplated by s. 605.2103, Florida Statutes.</w:t>
+        <w:t xml:space="preserve"> The purpose of the Company, and of each Protected Series, is to engage in any lawful business, purpose, or activity for which limited liability companies may be organized under the Act, together with any additional purpose set forth in the Articles of Organization and, as to a Protected Series, any additional purpose set forth in its Series Exhibit. An additional purpose so stated is cumulative and does not limit the general purpose stated in this Section. The Company, and each Protected Series in its own name, shall have all powers conferred by the Act, including with respect to each Protected Series the power to enter into and enforce contracts; to acquire, own, hold, improve, lease, encumber, and convey real, personal, and intangible property; to grant liens and security interests in its Associated Assets; to open and maintain deposit and investment accounts; to sue and be sued; and to conduct its activities and affairs in its own name, all as contemplated by s. 605.2103, Florida Statutes.  </w:t>
+      </w:r>
+      <w:r>
+        <w:rPr>
+          <w:rFonts w:ascii="Times New Roman" w:hAnsi="Times New Roman"/>
+          <w:b/>
+          <w:sz w:val="24"/>
+          <w:szCs w:val="24"/>
+        </w:rPr>
+        <w:t xml:space="preserve">Professional companies only.</w:t>
+      </w:r>
+      <w:r>
+        <w:rPr>
+          <w:rFonts w:ascii="Times New Roman" w:hAnsi="Times New Roman"/>
+          <w:sz w:val="24"/>
+          <w:szCs w:val="24"/>
+        </w:rPr>
+        <w:t xml:space="preserve"> Notwithstanding any other provision of this Agreement or any Series Exhibit, if the Company is organized as a professional limited liability company under Chapter 621, Florida Statutes, the Company and each Protected Series shall engage only in the professional services for which the Company was organized, together with investments and ownership of property permitted by s. 621.08. No Transfer of a Membership Interest or admission as a Member, including through a transfer-on-death designation, a permitted family Transfer, bankruptcy, or continuation after the last Member ceases to be a Member, is permitted unless the recipient is a professional corporation, professional limited liability company, or individual, each licensed or otherwise legally authorized to render the same specific professional services as those for which the Company was organized, as required by ss. 621.09(2) and 621.11(2). These requirements apply in addition to every other transfer and admission requirement of this Agreement, including any applicable S corporation shareholder eligibility requirement.</w:t>
       </w:r>
     </w:p>
     <w:p>
@@ -477,7 +494,7 @@
           <w:sz w:val="24"/>
           <w:szCs w:val="24"/>
         </w:rPr>
-        <w:t xml:space="preserve"> The Manager shall execute and cause to be filed with the Department all records the Act requires or permits, including Protected Series Designations, amendments thereto, statements of change, annual reports, and statements of dissolution, and shall take all other action necessary to maintain the Company and each Protected Series in good standing.</w:t>
+        <w:t xml:space="preserve"> The Manager shall execute and cause to be filed with the Department all records the Act requires or permits, including Protected Series Designations, amendments thereto, statements of change, annual reports, articles of dissolution of the Company, articles of protected series dissolution, and, after winding up a Protected Series, statements of designation cancellation, and shall take all other action necessary to maintain the Company and each Protected Series in good standing.</w:t>
       </w:r>
     </w:p>
     <w:p>
@@ -565,7 +582,7 @@
           <w:sz w:val="24"/>
           <w:szCs w:val="24"/>
         </w:rPr>
-        <w:t xml:space="preserve"> means the Florida Revised Uniform Limited Liability Company Act, Chapter 605, Florida Statutes, as amended, including the Protected Series Provisions.</w:t>
+        <w:t xml:space="preserve"> means the Florida Revised Limited Liability Company Act, Chapter 605, Florida Statutes, as amended, including the Protected Series Provisions.</w:t>
       </w:r>
     </w:p>
     <w:p>
@@ -2024,7 +2041,7 @@
           <w:sz w:val="24"/>
           <w:szCs w:val="24"/>
         </w:rPr>
-        <w:t xml:space="preserve">; or file a statement of dissolution of a Protected Series — the approval required by Section 14.1;</w:t>
+        <w:t xml:space="preserve">; or file articles of protected series dissolution — the approval required by Section 14.1;</w:t>
       </w:r>
     </w:p>
     <w:p>
@@ -2181,7 +2198,7 @@
           <w:sz w:val="24"/>
           <w:szCs w:val="24"/>
         </w:rPr>
-        <w:t xml:space="preserve"> The Company shall indemnify the Manager, and each Protected Series shall indemnify its Protected Series Manager, to the fullest extent permitted by the Act, against losses, claims, and expenses (including reasonable attorney's fees) incurred by reason of service in that capacity, except to the extent arising from conduct for which exoneration is prohibited by the Act or from an act exceeding the authority conferred by Section 5.4; </w:t>
+        <w:t xml:space="preserve"> The Company shall indemnify the Manager, and each Protected Series shall indemnify its Protected Series Manager, to the fullest extent permitted by the Act, against losses, claims, and expenses (including reasonable attorney's fees) incurred by reason of service in that capacity, except to the extent arising from conduct for which exoneration is prohibited by the Act or from an act taken without the approval Section 5.4 requires; </w:t>
       </w:r>
       <w:r>
         <w:rPr>
@@ -2198,7 +2215,7 @@
           <w:sz w:val="24"/>
           <w:szCs w:val="24"/>
         </w:rPr>
-        <w:t xml:space="preserve">, and any indemnification obligation relating to the activities of the Company generally is payable solely from the Associated Assets of the Company. A Manager who exceeds the authority conferred by Section 5.4 is liable to the Company or the affected Protected Series for any loss caused by that act, and the Company or Protected Series is entitled to indemnity from that Manager.</w:t>
+        <w:t xml:space="preserve">, and any indemnification obligation relating to the activities of the Company generally is payable solely from the Associated Assets of the Company. A Manager who acts without the approval Section 5.4 requires is liable to the Company or the affected Protected Series for any loss caused by that act, and the Company or Protected Series is entitled to indemnity from that Manager.</w:t>
       </w:r>
     </w:p>
     <w:p>
@@ -3017,7 +3034,7 @@
           <w:sz w:val="24"/>
           <w:szCs w:val="24"/>
         </w:rPr>
-        <w:t xml:space="preserve"> The Company has elected, or intends to elect, classification as an association taxable as a corporation and S corporation status under section 1362 of the Code, and it is intended that the election remain continuously in effect. Each Member shall execute the consents and other instruments (including IRS Form 2553) necessary or appropriate to make and maintain the election, and no election shall be revoked without the affirmative vote or consent of all Members. Each Protected Series is wholly owned by the Company. If a Protected Series is treated as an entity separate from the Company for federal income tax purposes, it is intended that the Protected Series be disregarded as an entity separate from its owner, so that its items of income, gain, loss, deduction, and credit are reported by the Company. No member of the Company shall take a position inconsistent with this Section on any return without the written consent of all members.</w:t>
+        <w:t xml:space="preserve"> The Company has elected, or intends to elect, classification as an association taxable as a corporation and S corporation status under section 1362 of the Code, and it is intended that the election remain continuously in effect. Each Member shall execute the consents and other instruments (including IRS Form 2553) necessary or appropriate to make and maintain the election, and no election shall be revoked without the affirmative vote or consent of all Members. Each Protected Series is wholly owned by the Company. If a Protected Series is treated as an entity separate from the Company for federal income tax purposes, it is intended that the Protected Series be disregarded as an entity separate from its owner, so that its items of income, gain, loss, deduction, and credit are reported by the Company. No Member of the Company shall take a position inconsistent with this Section on any return without the written consent of all Members.</w:t>
       </w:r>
     </w:p>
     <w:p>
@@ -3178,7 +3195,7 @@
           <w:sz w:val="24"/>
           <w:szCs w:val="24"/>
         </w:rPr>
-        <w:t xml:space="preserve"> Notwithstanding any other provision of this Agreement or of any Series Exhibit, all allocations and distributions — including distributions in liquidation of the Company or of any Protected Series — shall be made strictly pro rata in accordance with Percentage Interests, and every Membership Interest confers identical rights to distributions and liquidation proceeds.</w:t>
+        <w:t xml:space="preserve"> Notwithstanding any other provision of this Agreement or of any Series Exhibit, all allocations and distributions by the Company to its Members — including distributions in liquidation of the Company — shall be made strictly pro rata in accordance with Percentage Interests, and every Membership Interest confers identical rights to distributions and liquidation proceeds. All distributions by a Protected Series, including in liquidation, shall be made solely to the Company as provided in Sections 7.2 and 14.2.</w:t>
       </w:r>
     </w:p>
     <w:p>
@@ -3532,24 +3549,7 @@
           <w:sz w:val="24"/>
           <w:szCs w:val="24"/>
         </w:rPr>
-        <w:t xml:space="preserve"> In accordance with </w:t>
-      </w:r>
-      <w:r>
-        <w:rPr>
-          <w:rFonts w:ascii="Times New Roman" w:hAnsi="Times New Roman"/>
-          <w:i/>
-          <w:sz w:val="24"/>
-          <w:szCs w:val="24"/>
-        </w:rPr>
-        <w:t xml:space="preserve">In re Soderstrom</w:t>
-      </w:r>
-      <w:r>
-        <w:rPr>
-          <w:rFonts w:ascii="Times New Roman" w:hAnsi="Times New Roman"/>
-          <w:sz w:val="24"/>
-          <w:szCs w:val="24"/>
-        </w:rPr>
-        <w:t xml:space="preserve">, 484 B.R. 874 (M.D. Fla. 2013), this Agreement is a personal service agreement due to the managerial and governance duties and obligations owed by each Member and the Manager, and a bankruptcy trustee cannot assume or assign a debtor Member's interest in the Company in accordance with 11 U.S.C. §365(c)(1) without the prior written consent of the other Members.</w:t>
+        <w:t xml:space="preserve"> The Members acknowledge that this Agreement imposes continuing managerial and governance obligations and is intended to be an executory contract. Under 11 U.S.C. § 365(c)(1) and applicable Florida law (including Chapter 605 and this Agreement), a trustee or debtor in possession may not assume or assign a debtor Member’s governance or management rights, or cause a substitute to be admitted as a Member, without the prior written consent of the other Members. Nothing in this Section limits the estate’s interest in a Member’s transferable (economic) interest to the extent permitted by applicable law.</w:t>
       </w:r>
     </w:p>
     <w:p>
@@ -3954,7 +3954,7 @@
           <w:sz w:val="24"/>
           <w:szCs w:val="24"/>
         </w:rPr>
-        <w:t xml:space="preserve"> Upon dissolution of the Company, the Manager (or, if there is none, a person designated by a Majority in Interest) shall wind up the Company and each Protected Series. After the winding up of each Protected Series under Section 14.2, the remaining Associated Assets of the Company shall be applied: first, to pay or provide for the Company's Associated Liabilities to creditors other than Members; next, to pay or provide for the Company's Associated Liabilities to Members as creditors; and finally, the balance to the Members in proportion to their Percentage Interests. All distributions in winding up, whether of the Company or of any Protected Series, shall be made in proportion to Percentage Interests, so that every Membership Interest confers identical rights to liquidation proceeds. Articles of dissolution shall be filed as the Act requires, and the Company shall terminate when winding up is complete.</w:t>
+        <w:t xml:space="preserve"> Upon dissolution of the Company, the Manager (or, if there is none, a person designated by a Majority in Interest) shall wind up the Company and each Protected Series. After the winding up of each Protected Series under Section 14.2, the remaining Associated Assets of the Company shall be applied: first, to pay or provide for the Company's Associated Liabilities to creditors other than Members; next, to pay or provide for the Company's Associated Liabilities to Members as creditors; and finally, the balance to the Members in proportion to their Percentage Interests. All distributions by the Company to its Members in winding up shall be made in proportion to Percentage Interests, so that every Membership Interest confers identical rights to liquidation proceeds. Distributions in winding up a Protected Series shall be made solely to the Company as provided in Section 14.2. Articles of dissolution shall be filed as the Act requires, and the Company shall terminate when winding up is complete.</w:t>
       </w:r>
     </w:p>
     <w:p>
@@ -4347,7 +4347,7 @@
           <w:sz w:val="24"/>
           <w:szCs w:val="24"/>
         </w:rPr>
-        <w:t xml:space="preserve">IN WITNESS WHEREOF, the undersigned have executed this Agreement effective as of the date(s) set forth below.</w:t>
+        <w:t xml:space="preserve">IN WITNESS WHEREOF, the undersigned have executed this Agreement as of the Effective Date.</w:t>
       </w:r>
     </w:p>
     <w:p>

</xml_diff>

<commit_message>
Implement Batch 31 approved guidance and preserve retained wording
</commit_message>
<xml_diff>
--- a/docs/word/FPSLLC Operating Agreement - Manager-Managed (S Corporation) - DRAFT.docx
+++ b/docs/word/FPSLLC Operating Agreement - Manager-Managed (S Corporation) - DRAFT.docx
@@ -1452,7 +1452,7 @@
           <w:sz w:val="24"/>
           <w:szCs w:val="24"/>
         </w:rPr>
-        <w:t xml:space="preserve"> The Members and their Percentage Interests are set forth on Exhibit A. Membership interests are of a single class and are expressed as percentages; no certificates shall be issued unless the Manager determines otherwise. Each Member's interest in the Company is personal property for all purposes.</w:t>
+        <w:t xml:space="preserve"> The Members and their Percentage Interests are set forth on Exhibit A. Membership interests are of a single class and are expressed as percentages or fractions of the whole, as set forth on Exhibit A; no certificates shall be issued unless the Manager determines otherwise. Each Member's interest in the Company is personal property for all purposes.</w:t>
       </w:r>
     </w:p>
     <w:p>
@@ -2263,7 +2263,7 @@
           <w:sz w:val="24"/>
           <w:szCs w:val="24"/>
         </w:rPr>
-        <w:t xml:space="preserve"> With the consent of all Members required by Section 5.4(i), the Manager may cause the Company to file with the Department a statement of authority under s. 605.0302, Florida Statutes, stating the authority, or the limitations on the authority, of the Manager, of any Protected Series Manager, or of any person holding a specified position, to transfer or encumber real property held in the name of the Company or of a Protected Series, and may cause a certified copy of that statement to be recorded in the official records of any county in which the real property is located. A statement so filed shall be consistent with this Agreement, and shall be amended or cancelled as necessary to keep it accurate. The limitations in Section 5.4 apply to the Manager whether or not a statement of authority is filed or recorded.</w:t>
+        <w:t xml:space="preserve"> With the consent of all Members required by Section 5.4(i), the Manager may cause a statement of authority to be filed with the Department for the Company or the relevant Protected Series under s. 605.0302, Florida Statutes, stating the authority, or the limitations on the authority, of the Manager, of any Protected Series Manager, or of any person holding a specified position, to transfer or encumber real property held in the name of the entity identified in the statement, and may cause a certified copy of that statement to be recorded in the official records of any county in which the real property is located. A statement concerning real property held in the name of the Company shall identify the Company as the entity whose authority is stated. A statement concerning real property held in the name of a Protected Series shall be filed for and identify that Protected Series as the entity whose authority is stated. A statement so filed shall be consistent with this Agreement, and shall be amended or cancelled as necessary to keep it accurate. The limitations in Section 5.4 apply to the Manager whether or not a statement of authority is filed or recorded.</w:t>
       </w:r>
     </w:p>
     <w:p>

</xml_diff>

<commit_message>
Keep Word drafting end labels with their preceding text
</commit_message>
<xml_diff>
--- a/docs/word/FPSLLC Operating Agreement - Manager-Managed (S Corporation) - DRAFT.docx
+++ b/docs/word/FPSLLC Operating Agreement - Manager-Managed (S Corporation) - DRAFT.docx
@@ -380,6 +380,7 @@
     </w:p>
     <w:p>
       <w:pPr>
+        <w:keepNext/>
         <w:widowControl/>
         <w:spacing w:after="160"/>
         <w:jc w:val="both"/>
@@ -4518,6 +4519,7 @@
     </w:p>
     <w:p>
       <w:pPr>
+        <w:keepNext/>
         <w:widowControl/>
         <w:spacing w:after="160"/>
         <w:jc w:val="both"/>
@@ -6989,6 +6991,7 @@
     </w:p>
     <w:p>
       <w:pPr>
+        <w:keepNext/>
         <w:widowControl/>
         <w:spacing w:after="160"/>
         <w:jc w:val="both"/>
@@ -7086,6 +7089,7 @@
     </w:p>
     <w:p>
       <w:pPr>
+        <w:keepNext/>
         <w:keepLines/>
         <w:widowControl/>
         <w:spacing w:after="160"/>

</xml_diff>

<commit_message>
Keep drafting table labels concise without spilling exhibit text
</commit_message>
<xml_diff>
--- a/docs/word/FPSLLC Operating Agreement - Manager-Managed (S Corporation) - DRAFT.docx
+++ b/docs/word/FPSLLC Operating Agreement - Manager-Managed (S Corporation) - DRAFT.docx
@@ -5261,7 +5261,7 @@
                 <w:sz w:val="22"/>
                 <w:szCs w:val="22"/>
               </w:rPr>
-              <w:t xml:space="preserve">[If joint holding: </w:t>
+              <w:t xml:space="preserve">[If joint: </w:t>
             </w:r>
             <w:r>
               <w:rPr>
@@ -6290,7 +6290,7 @@
                 <w:sz w:val="22"/>
                 <w:szCs w:val="22"/>
               </w:rPr>
-              <w:t xml:space="preserve">[If married couple: </w:t>
+              <w:t xml:space="preserve">[If spouses: </w:t>
             </w:r>
             <w:r>
               <w:rPr>
@@ -6572,7 +6572,7 @@
                 <w:sz w:val="22"/>
                 <w:szCs w:val="22"/>
               </w:rPr>
-              <w:t xml:space="preserve">[If additional series purpose: </w:t>
+              <w:t xml:space="preserve">[If additional purpose: </w:t>
             </w:r>
             <w:r>
               <w:rPr>

</xml_diff>

<commit_message>
Complete Batch 34 optional wording and document pagination improvements
</commit_message>
<xml_diff>
--- a/docs/word/FPSLLC Operating Agreement - Manager-Managed (S Corporation) - DRAFT.docx
+++ b/docs/word/FPSLLC Operating Agreement - Manager-Managed (S Corporation) - DRAFT.docx
@@ -84,7 +84,7 @@
           <w:sz w:val="24"/>
           <w:szCs w:val="24"/>
         </w:rPr>
-        <w:t xml:space="preserve">(Manager-Managed — S Corporation)</w:t>
+        <w:t xml:space="preserve">(Manager-Managed — Multiple Members / S Corporation)</w:t>
       </w:r>
     </w:p>
     <w:p>
@@ -7831,7 +7831,7 @@
           <w:sz w:val="24"/>
           <w:szCs w:val="24"/>
         </w:rPr>
-        <w:t xml:space="preserve">Form document — [COMPANY NAME], LLC Operating Agreement (Manager-Managed / S Corporation), v1 draft. Statutory citations in this form: ss. 48.062, 605.0102, 605.0302, 605.0502, 605.0503, 605.0702, 605.2101, 605.2103, 605.2107, 605.2201, 605.2301, 605.2302, 605.2303, 605.2304, 605.2401, 605.2602, 605.2605, 605.2607, 605.2802, 605.04074, 605.04091, 711.50, 711.501, 711.512, Fla. Stat.; 11 U.S.C. §365; In re Soderstrom, 484 B.R. 874 (M.D. Fla. 2013). Internal Revenue Code sections: 1361, 1362, 1366, 1377, 1378.</w:t>
+        <w:t xml:space="preserve">Form document — [COMPANY NAME], LLC Operating Agreement (Manager-Managed, Multiple Members / S Corporation), v1 draft. Statutory citations in this form: ss. 48.062, 605.0102, 605.0302, 605.0502, 605.0503, 605.0702, 605.2101, 605.2103, 605.2107, 605.2201, 605.2301, 605.2302, 605.2303, 605.2304, 605.2401, 605.2602, 605.2605, 605.2607, 605.2802, 605.04074, 605.04091, 711.50, 711.501, 711.512, Fla. Stat.; 11 U.S.C. §365; In re Soderstrom, 484 B.R. 874 (M.D. Fla. 2013). Internal Revenue Code sections: 1361, 1362, 1366, 1377, 1378.</w:t>
       </w:r>
     </w:p>
     <w:p>

</xml_diff>

<commit_message>
Carry approved agreement wording through documents and portal guidance
</commit_message>
<xml_diff>
--- a/docs/word/FPSLLC Operating Agreement - Manager-Managed (S Corporation) - DRAFT.docx
+++ b/docs/word/FPSLLC Operating Agreement - Manager-Managed (S Corporation) - DRAFT.docx
@@ -357,7 +357,7 @@
           <w:sz w:val="24"/>
           <w:szCs w:val="24"/>
         </w:rPr>
-        <w:t xml:space="preserve"> The purpose of the Company, and of each Protected Series, is to engage in any lawful business, purpose, or activity for which limited liability companies may be organized under the Act, together with any additional purpose set forth in the Articles of Organization and, as to a Protected Series, any additional purpose set forth in its Series Exhibit. An additional purpose so stated is cumulative and does not limit the general purpose stated in this Section. The Company, and each Protected Series in its own name, shall have all powers conferred by the Act, including with respect to each Protected Series the power to enter into and enforce contracts; to acquire, own, hold, improve, lease, encumber, and convey real, personal, and intangible property; to grant liens and security interests in its Associated Assets; to open and maintain deposit and investment accounts; to sue and be sued; and to conduct its activities and affairs in its own name, all as contemplated by s. 605.2103, Florida Statutes.</w:t>
+        <w:t xml:space="preserve"> The purpose of the Company, and of each Protected Series, is to engage in any lawful business, purpose, or activity for which limited liability companies may be organized under the Act, together with any additional purpose set forth in the Articles of Organization and, as to a Protected Series, any additional purpose set forth in its Series Exhibit. An additional purpose so stated is cumulative and does not limit the general purpose stated in this Section. The Company, and each Protected Series in its own name, shall have all powers conferred by the Act, including with respect to each Protected Series the power to enter into and enforce contracts; to acquire, own, hold, improve, lease, encumber, and convey real, personal, and intangible property; to grant liens and security interests in its Associated Assets; to open and maintain deposit and investment accounts; to sue and be sued; and to conduct its activities and affairs in its own name, all as contemplated by s. 605.2104, Florida Statutes.</w:t>
       </w:r>
     </w:p>
     <w:p>
@@ -1107,7 +1107,7 @@
           <w:sz w:val="24"/>
           <w:szCs w:val="24"/>
         </w:rPr>
-        <w:t xml:space="preserve"> Members, the Company may establish one or more Protected Series by causing a Protected Series Designation to be signed and filed with the Department as provided in s. 605.2201, Florida Statutes. At or before the filing of each Protected Series Designation, the Members and the Manager shall adopt a Series Exhibit for the new Protected Series. The Manager is authorized to execute and file each Protected Series Designation approved under this Section. Each Protected Series shall be established without Associated Members.</w:t>
+        <w:t xml:space="preserve"> Members, the Company may establish one or more Protected Series by causing a Protected Series Designation to be signed and filed with the Department as provided in s. 605.2201, Florida Statutes. At or before the filing of each Protected Series Designation, the Members and the Manager shall adopt a Series Exhibit for the new Protected Series. The Manager is authorized to execute and file each Protected Series Designation approved under this Section. Each Protected Series shall be established without Associated Members. A Protected Series is established when its Protected Series Designation takes effect under ss. 605.2201(3) and 605.0207, Florida Statutes.</w:t>
       </w:r>
     </w:p>
     <w:p>
@@ -1147,7 +1147,7 @@
           <w:sz w:val="24"/>
           <w:szCs w:val="24"/>
         </w:rPr>
-        <w:t xml:space="preserve">(a) is a "person" for purposes of the Act and the Uniform Commercial Code, distinct from the Company, from every other Protected Series, from each Member, and from the Manager;</w:t>
+        <w:t xml:space="preserve">(a) is a "person" for purposes of the Act (s. 605.2103) and the Uniform Commercial Code (s. 671.201(32)), distinct from the Company, from every other Protected Series, from each Member, and from the Manager;</w:t>
       </w:r>
     </w:p>
     <w:p>
@@ -2516,7 +2516,7 @@
           <w:sz w:val="24"/>
           <w:szCs w:val="24"/>
         </w:rPr>
-        <w:t xml:space="preserve"> Upon the approval of a Majority in Interest, each Member shall have the duty and obligation to contribute additional capital to the Company or to the affected Protected Series, in proportion to the Members' Percentage Interests, in the aggregate amount so approved, payable within thirty (30) days after written notice of the approved call; provided, that unless approved by all Members, no Member shall be required to contribute more than $[CAP] in the aggregate in any calendar year under this Section. This obligation is a material, unperformed, future obligation of each Member within the meaning of Section 11.1. </w:t>
+        <w:t xml:space="preserve"> Upon the approval of a Majority in Interest, each Member shall have the duty and obligation to contribute additional capital to the Company, in proportion to the Members' Percentage Interests, in the aggregate amount so approved, payable within thirty (30) days after written notice of the approved call; provided, that unless approved by all Members, no Member shall be required to contribute more than $[CAP] in the aggregate in any calendar year under this Section. The Company shall record any contribution it makes to an affected Protected Series separately in that series' records and Series Exhibit. This obligation is a material, unperformed, future obligation of each Member within the meaning of Section 11.1. </w:t>
       </w:r>
       <w:r>
         <w:rPr>
@@ -2525,7 +2525,7 @@
           <w:sz w:val="24"/>
           <w:szCs w:val="24"/>
         </w:rPr>
-        <w:t xml:space="preserve">(To omit this provision, replace the text of this Section 6.2 and of Section 6.3 with "[Reserved.]" and replace Section 11.1(a) with "(a) [Reserved.]" — do not renumber any section. If omitted, no Member has any obligation to contribute capital beyond Section 6.1.)</w:t>
+        <w:t xml:space="preserve">(To omit this provision, replace the text of this Section 6.2 and of Section 6.3 with "[Reserved.]" and replace Section 11.1(a) with "(a) [Reserved.]" — do not renumber any section. If omitted, also use the no-capital-call wordings of Sections 6.6, 14.5 and 15.1(b). No Member has any obligation to contribute capital beyond Section 6.1.)</w:t>
       </w:r>
     </w:p>
     <w:p>
@@ -2549,7 +2549,7 @@
           <w:sz w:val="24"/>
           <w:szCs w:val="24"/>
         </w:rPr>
-        <w:t xml:space="preserve"> If a Member fails to pay an additional capital contribution required under Section 6.2 when due, the Company (or the affected Protected Series) may pursue any remedy available at law or in equity for the failure, and in addition, the non-defaulting Members who elect to do so may advance the defaulted amount, in which case the Percentage Interests of the defaulting and advancing Members shall be adjusted to reflect the aggregate capital contributed by each Member following the advance.</w:t>
+        <w:t xml:space="preserve"> If a Member fails to pay an additional capital contribution required under Section 6.2 when due, the Company may pursue any remedy available at law or in equity for the failure, and in addition, the non-defaulting Members who elect to do so may advance the defaulted amount, in which case the Percentage Interests of the defaulting and advancing Members shall be adjusted to reflect the aggregate capital contributed by each Member following the advance.</w:t>
       </w:r>
     </w:p>
     <w:p>
@@ -2621,7 +2621,7 @@
           <w:sz w:val="24"/>
           <w:szCs w:val="24"/>
         </w:rPr>
-        <w:t xml:space="preserve"> The Company shall maintain a record of each Member's contributions to the Company and to each Protected Series. Contributions do not bear interest and confer no priority or preference of any kind: every Membership Interest carries rights to allocations, distributions, and liquidation proceeds identical in proportion to Percentage Interests. Nothing in this Agreement personally obligates any Member to contribute capital beyond the contributions required by Sections 6.1 and 6.2.</w:t>
+        <w:t xml:space="preserve"> The Company shall maintain a record of each Member's contributions to the Company and the Company's contributions to each Protected Series. Contributions do not bear interest and confer no priority or preference of any kind: every Membership Interest carries rights to allocations, distributions, and liquidation proceeds identical in proportion to Percentage Interests. Nothing in this Agreement personally obligates any Member to contribute capital beyond the contributions required by Sections 6.1 and 6.2.</w:t>
       </w:r>
     </w:p>
     <w:p>
@@ -2916,7 +2916,7 @@
           <w:sz w:val="24"/>
           <w:szCs w:val="24"/>
         </w:rPr>
-        <w:t xml:space="preserve"> A properly recorded instrument naming the acquiring or conveying Protected Series (by its full statutory name) or the Company, as applicable, serves as an association record and is conclusive of the signer's authority in favor of a person giving value without knowledge of a lack of authority (ss. 605.2301(2)(b) and 605.2301(3)(b), Florida Statutes). Where an interest in real property is held through a representative, nominee, or similar arrangement as permitted by s. 605.2301(5), Florida Statutes, the arrangement shall be documented under Section 8.4, and the association of the interest shall be established by those records.</w:t>
+        <w:t xml:space="preserve"> To the extent a properly recorded instrument naming the acquiring or conveying Protected Series (by its full statutory name) or the Company, as applicable, is in favor of a person giving value without knowledge of a lack of authority, it serves as an association record and is conclusive of the signer's authority (ss. 605.2301(2)(b) and 605.2301(3)(b), Florida Statutes). Where an interest in real property is held through a representative, nominee, or similar arrangement as permitted by s. 605.2301(5), Florida Statutes, the arrangement shall be documented under Section 8.4, and the association of the interest shall be established by those records.</w:t>
       </w:r>
     </w:p>
     <w:p>
@@ -3623,7 +3623,7 @@
           <w:sz w:val="24"/>
           <w:szCs w:val="24"/>
         </w:rPr>
-        <w:t xml:space="preserve"> upon approval of a Majority in Interest as provided in Section 6.2, the duty and obligation of each Member to contribute additional capital to the Company or the affected Protected Series; (b) the duty and obligation of each Member to materially participate in the governance of the Company and of each Protected Series, as provided in Section 4.6; (c) </w:t>
+        <w:t xml:space="preserve"> upon approval of a Majority in Interest as provided in Section 6.2, the duty and obligation of each Member to contribute additional capital to the Company; (b) the duty and obligation of each Member to materially participate in the governance of the Company and of each Protected Series, as provided in Section 4.6; (c) </w:t>
       </w:r>
       <w:r>
         <w:rPr>
@@ -7833,7 +7833,7 @@
           <w:sz w:val="24"/>
           <w:szCs w:val="24"/>
         </w:rPr>
-        <w:t xml:space="preserve">Form document — [COMPANY NAME], LLC Operating Agreement (Manager-Managed, Multiple Members / S Corporation), v1 draft. Statutory citations in this form: ss. 48.062, 605.0102, 605.0302, 605.0502, 605.0503, 605.0702, 605.2101, 605.2103, 605.2107, 605.2201, 605.2301, 605.2302, 605.2303, 605.2304, 605.2401, 605.2602, 605.2605, 605.2607, 605.2802, 605.04074, 605.04091, 711.50, 711.501, 711.512, Fla. Stat.; 11 U.S.C. §365; In re Soderstrom, 484 B.R. 874 (M.D. Fla. 2013). Internal Revenue Code sections: 1361, 1362, 1366, 1377, 1378.</w:t>
+        <w:t xml:space="preserve">Form document — [COMPANY NAME], LLC Operating Agreement (Manager-Managed, Multiple Members / S Corporation), v1 draft. Statutory citations in this form: ss. 48.062, 605.0102, 605.0207, 605.0302, 605.0502, 605.0503, 605.0702, 605.2101, 605.2103, 605.2104, 605.2107, 605.2201, 605.2301, 605.2302, 605.2303, 605.2304, 605.2401, 605.2602, 605.2605, 605.2607, 605.2802, 605.04074, 605.04091, 711.50, 711.501, 711.512, Fla. Stat.; 11 U.S.C. §365; In re Soderstrom, 484 B.R. 874 (M.D. Fla. 2013). Internal Revenue Code sections: 1361, 1362, 1366, 1377, 1378.</w:t>
       </w:r>
     </w:p>
     <w:p>

</xml_diff>